<commit_message>
added Team Journal week 2
</commit_message>
<xml_diff>
--- a/Reports, Logs & Evaluations/Team Journal/Team Journal SDT213.docx
+++ b/Reports, Logs & Evaluations/Team Journal/Team Journal SDT213.docx
@@ -206,7 +206,22 @@
         <w:rPr>
           <w:rtl w:val="0"/>
         </w:rPr>
-        <w:t xml:space="preserve">27/09/26 meeting</w:t>
+        <w:t xml:space="preserve">27/09/26 </w:t>
+      </w:r>
+      <w:hyperlink r:id="rId7">
+        <w:r>
+          <w:rPr>
+            <w:color w:val="1155cc"/>
+            <w:u w:val="single"/>
+            <w:rtl w:val="0"/>
+          </w:rPr>
+          <w:t xml:space="preserve">meeting link</w:t>
+        </w:r>
+      </w:hyperlink>
+      <w:r>
+        <w:rPr>
+          <w:rtl w:val="0"/>
+        </w:rPr>
       </w:r>
     </w:p>
     <w:p>
@@ -226,7 +241,7 @@
         <w:rPr>
           <w:rtl w:val="0"/>
         </w:rPr>
-        <w:t xml:space="preserve">: </w:t>
+        <w:t xml:space="preserve">: Client requirements, future project development, and task delegation.</w:t>
       </w:r>
     </w:p>
     <w:p>
@@ -246,7 +261,7 @@
         <w:rPr>
           <w:rtl w:val="0"/>
         </w:rPr>
-        <w:t xml:space="preserve">: </w:t>
+        <w:t xml:space="preserve">: Permission for each role (read-only/redact) was discussed; proposals for conflict resolution were made, but it was decided to pick one when the system is in the needed state.</w:t>
       </w:r>
     </w:p>
     <w:p>
@@ -266,7 +281,7 @@
         <w:rPr>
           <w:rtl w:val="0"/>
         </w:rPr>
-        <w:t xml:space="preserve">:</w:t>
+        <w:t xml:space="preserve">: Phase 1 requirements report.</w:t>
       </w:r>
     </w:p>
     <w:p>
@@ -286,7 +301,7 @@
         <w:rPr>
           <w:rtl w:val="0"/>
         </w:rPr>
-        <w:t xml:space="preserve">: </w:t>
+        <w:t xml:space="preserve">: Prepare a demo for the Phase 1 presentation.</w:t>
       </w:r>
     </w:p>
     <w:p>
@@ -307,6 +322,18 @@
           <w:rtl w:val="0"/>
         </w:rPr>
         <w:t xml:space="preserve">: </w:t>
+      </w:r>
+      <w:r>
+        <w:rPr>
+          <w:rtl w:val="0"/>
+        </w:rPr>
+        <w:t xml:space="preserve">Conflict resolution remains in question; it was decided to address this in Phase 2 as it is difficult to find a resolution without implementation.</w:t>
+      </w:r>
+      <w:r>
+        <w:rPr>
+          <w:rtl w:val="0"/>
+        </w:rPr>
+        <w:t xml:space="preserve"> </w:t>
       </w:r>
     </w:p>
     <w:p>

</xml_diff>

<commit_message>
added Team Journal week 3
</commit_message>
<xml_diff>
--- a/Reports, Logs & Evaluations/Team Journal/Team Journal SDT213.docx
+++ b/Reports, Logs & Evaluations/Team Journal/Team Journal SDT213.docx
@@ -366,67 +366,145 @@
         <w:rPr>
           <w:rtl w:val="0"/>
         </w:rPr>
-        <w:t xml:space="preserve">04/10/26 meeting</w:t>
-      </w:r>
-    </w:p>
-    <w:p>
-      <w:pPr>
-        <w:spacing w:line="360" w:lineRule="auto"/>
-        <w:rPr/>
-      </w:pPr>
-      <w:r>
-        <w:rPr>
-          <w:rtl w:val="0"/>
-        </w:rPr>
-        <w:t xml:space="preserve">Discussed: </w:t>
-      </w:r>
-    </w:p>
-    <w:p>
-      <w:pPr>
-        <w:spacing w:line="360" w:lineRule="auto"/>
-        <w:rPr/>
-      </w:pPr>
-      <w:r>
-        <w:rPr>
-          <w:rtl w:val="0"/>
-        </w:rPr>
-        <w:t xml:space="preserve">Decisions: </w:t>
-      </w:r>
-    </w:p>
-    <w:p>
-      <w:pPr>
-        <w:spacing w:line="360" w:lineRule="auto"/>
-        <w:rPr/>
-      </w:pPr>
-      <w:r>
-        <w:rPr>
-          <w:rtl w:val="0"/>
-        </w:rPr>
-        <w:t xml:space="preserve">Previous tasks completion:</w:t>
-      </w:r>
-    </w:p>
-    <w:p>
-      <w:pPr>
-        <w:spacing w:line="360" w:lineRule="auto"/>
-        <w:rPr/>
-      </w:pPr>
-      <w:r>
-        <w:rPr>
-          <w:rtl w:val="0"/>
-        </w:rPr>
-        <w:t xml:space="preserve">Planned tasks for the week: </w:t>
-      </w:r>
-    </w:p>
-    <w:p>
-      <w:pPr>
-        <w:spacing w:line="360" w:lineRule="auto"/>
-        <w:rPr/>
-      </w:pPr>
-      <w:r>
-        <w:rPr>
-          <w:rtl w:val="0"/>
-        </w:rPr>
-        <w:t xml:space="preserve">Issues: </w:t>
+        <w:t xml:space="preserve">04/10/26 </w:t>
+      </w:r>
+      <w:hyperlink r:id="rId8">
+        <w:r>
+          <w:rPr>
+            <w:color w:val="1155cc"/>
+            <w:u w:val="single"/>
+            <w:rtl w:val="0"/>
+          </w:rPr>
+          <w:t xml:space="preserve">meeting link</w:t>
+        </w:r>
+      </w:hyperlink>
+      <w:r>
+        <w:rPr>
+          <w:rtl w:val="0"/>
+        </w:rPr>
+      </w:r>
+    </w:p>
+    <w:p>
+      <w:pPr>
+        <w:spacing w:line="360" w:lineRule="auto"/>
+        <w:rPr/>
+      </w:pPr>
+      <w:r>
+        <w:rPr>
+          <w:i w:val="1"/>
+          <w:iCs w:val="1"/>
+          <w:rtl w:val="0"/>
+        </w:rPr>
+        <w:t xml:space="preserve">Discussed</w:t>
+      </w:r>
+      <w:r>
+        <w:rPr>
+          <w:rtl w:val="0"/>
+        </w:rPr>
+        <w:t xml:space="preserve">: Presentation of Phase 1, fixes to be applied, vision for Phase 2.</w:t>
+      </w:r>
+    </w:p>
+    <w:p>
+      <w:pPr>
+        <w:spacing w:line="360" w:lineRule="auto"/>
+        <w:rPr/>
+      </w:pPr>
+      <w:r>
+        <w:rPr>
+          <w:i w:val="1"/>
+          <w:iCs w:val="1"/>
+          <w:rtl w:val="0"/>
+        </w:rPr>
+        <w:t xml:space="preserve">Decisions</w:t>
+      </w:r>
+      <w:r>
+        <w:rPr>
+          <w:rtl w:val="0"/>
+        </w:rPr>
+        <w:t xml:space="preserve">: Meet with Client to discuss applied fixes and start Phase 2.</w:t>
+      </w:r>
+    </w:p>
+    <w:p>
+      <w:pPr>
+        <w:spacing w:line="360" w:lineRule="auto"/>
+        <w:rPr/>
+      </w:pPr>
+      <w:r>
+        <w:rPr>
+          <w:i w:val="1"/>
+          <w:iCs w:val="1"/>
+          <w:rtl w:val="0"/>
+        </w:rPr>
+        <w:t xml:space="preserve">Previous tasks completion</w:t>
+      </w:r>
+      <w:r>
+        <w:rPr>
+          <w:rtl w:val="0"/>
+        </w:rPr>
+        <w:t xml:space="preserve">: Phase 1 Presentation, some fixes applied.</w:t>
+      </w:r>
+    </w:p>
+    <w:p>
+      <w:pPr>
+        <w:spacing w:line="360" w:lineRule="auto"/>
+        <w:rPr/>
+      </w:pPr>
+      <w:r>
+        <w:rPr>
+          <w:i w:val="1"/>
+          <w:iCs w:val="1"/>
+          <w:rtl w:val="0"/>
+        </w:rPr>
+        <w:t xml:space="preserve">Planned tasks for the week</w:t>
+      </w:r>
+      <w:r>
+        <w:rPr>
+          <w:rtl w:val="0"/>
+        </w:rPr>
+        <w:t xml:space="preserve">: Meet client, start diagrams/ UML, ask </w:t>
+      </w:r>
+      <w:r>
+        <w:rPr>
+          <w:rtl w:val="0"/>
+        </w:rPr>
+        <w:t xml:space="preserve">instructor</w:t>
+      </w:r>
+      <w:r>
+        <w:rPr>
+          <w:rtl w:val="0"/>
+        </w:rPr>
+        <w:t xml:space="preserve"> about Phase II format.</w:t>
+      </w:r>
+    </w:p>
+    <w:p>
+      <w:pPr>
+        <w:spacing w:line="360" w:lineRule="auto"/>
+        <w:rPr/>
+      </w:pPr>
+      <w:r>
+        <w:rPr>
+          <w:i w:val="1"/>
+          <w:iCs w:val="1"/>
+          <w:rtl w:val="0"/>
+        </w:rPr>
+        <w:t xml:space="preserve">Issues</w:t>
+      </w:r>
+      <w:r>
+        <w:rPr>
+          <w:rtl w:val="0"/>
+        </w:rPr>
+        <w:t xml:space="preserve">: Project optimization, how to add another room or instructor, Phase II format</w:t>
+      </w:r>
+    </w:p>
+    <w:p>
+      <w:pPr>
+        <w:spacing w:line="360" w:lineRule="auto"/>
+        <w:rPr/>
+      </w:pPr>
+      <w:r>
+        <w:rPr>
+          <w:rtl w:val="0"/>
+        </w:rPr>
       </w:r>
     </w:p>
     <w:sectPr>

</xml_diff>

<commit_message>
added team journal week 4
</commit_message>
<xml_diff>
--- a/Reports, Logs & Evaluations/Team Journal/Team Journal SDT213.docx
+++ b/Reports, Logs & Evaluations/Team Journal/Team Journal SDT213.docx
@@ -494,6 +494,156 @@
           <w:rtl w:val="0"/>
         </w:rPr>
         <w:t xml:space="preserve">: Project optimization, how to add another room or instructor, Phase II format</w:t>
+      </w:r>
+    </w:p>
+    <w:p>
+      <w:pPr>
+        <w:spacing w:line="360" w:lineRule="auto"/>
+        <w:rPr/>
+      </w:pPr>
+      <w:r>
+        <w:rPr>
+          <w:rtl w:val="0"/>
+        </w:rPr>
+      </w:r>
+    </w:p>
+    <w:p>
+      <w:pPr>
+        <w:rPr/>
+      </w:pPr>
+      <w:r>
+        <w:rPr>
+          <w:rtl w:val="0"/>
+        </w:rPr>
+        <w:t xml:space="preserve">Week 4: 05/10/26-11/10/26</w:t>
+      </w:r>
+    </w:p>
+    <w:p>
+      <w:pPr>
+        <w:spacing w:line="360" w:lineRule="auto"/>
+        <w:rPr/>
+      </w:pPr>
+      <w:r>
+        <w:rPr>
+          <w:rtl w:val="0"/>
+        </w:rPr>
+        <w:t xml:space="preserve">11/10/26 </w:t>
+      </w:r>
+      <w:hyperlink r:id="rId9">
+        <w:r>
+          <w:rPr>
+            <w:color w:val="1155cc"/>
+            <w:u w:val="single"/>
+            <w:rtl w:val="0"/>
+          </w:rPr>
+          <w:t xml:space="preserve">meeting link</w:t>
+        </w:r>
+      </w:hyperlink>
+      <w:r>
+        <w:rPr>
+          <w:rtl w:val="0"/>
+        </w:rPr>
+        <w:t xml:space="preserve">  </w:t>
+      </w:r>
+    </w:p>
+    <w:p>
+      <w:pPr>
+        <w:spacing w:line="360" w:lineRule="auto"/>
+        <w:rPr/>
+      </w:pPr>
+      <w:r>
+        <w:rPr>
+          <w:i w:val="1"/>
+          <w:iCs w:val="1"/>
+          <w:rtl w:val="0"/>
+        </w:rPr>
+        <w:t xml:space="preserve">Discussed</w:t>
+      </w:r>
+      <w:r>
+        <w:rPr>
+          <w:rtl w:val="0"/>
+        </w:rPr>
+        <w:t xml:space="preserve">: Applied fixes after Phase 1, working process for Phase 2.</w:t>
+      </w:r>
+    </w:p>
+    <w:p>
+      <w:pPr>
+        <w:spacing w:line="360" w:lineRule="auto"/>
+        <w:rPr/>
+      </w:pPr>
+      <w:r>
+        <w:rPr>
+          <w:i w:val="1"/>
+          <w:iCs w:val="1"/>
+          <w:rtl w:val="0"/>
+        </w:rPr>
+        <w:t xml:space="preserve">Decisions</w:t>
+      </w:r>
+      <w:r>
+        <w:rPr>
+          <w:rtl w:val="0"/>
+        </w:rPr>
+        <w:t xml:space="preserve">: Meet with Client, finalize diagrams and use cases, start testing and prototyping.</w:t>
+      </w:r>
+    </w:p>
+    <w:p>
+      <w:pPr>
+        <w:spacing w:line="360" w:lineRule="auto"/>
+        <w:rPr/>
+      </w:pPr>
+      <w:r>
+        <w:rPr>
+          <w:i w:val="1"/>
+          <w:iCs w:val="1"/>
+          <w:rtl w:val="0"/>
+        </w:rPr>
+        <w:t xml:space="preserve">Previous tasks completion</w:t>
+      </w:r>
+      <w:r>
+        <w:rPr>
+          <w:rtl w:val="0"/>
+        </w:rPr>
+        <w:t xml:space="preserve">: Use Case Scenarios (to finalize), CRC, Class Diagram, and class descriptions.</w:t>
+      </w:r>
+    </w:p>
+    <w:p>
+      <w:pPr>
+        <w:spacing w:line="360" w:lineRule="auto"/>
+        <w:rPr/>
+      </w:pPr>
+      <w:r>
+        <w:rPr>
+          <w:i w:val="1"/>
+          <w:iCs w:val="1"/>
+          <w:rtl w:val="0"/>
+        </w:rPr>
+        <w:t xml:space="preserve">Planned tasks for the week</w:t>
+      </w:r>
+      <w:r>
+        <w:rPr>
+          <w:rtl w:val="0"/>
+        </w:rPr>
+        <w:t xml:space="preserve">: Meet with the client, start testing, and create an initial code prototype.</w:t>
+      </w:r>
+    </w:p>
+    <w:p>
+      <w:pPr>
+        <w:spacing w:line="360" w:lineRule="auto"/>
+        <w:rPr/>
+      </w:pPr>
+      <w:r>
+        <w:rPr>
+          <w:i w:val="1"/>
+          <w:iCs w:val="1"/>
+          <w:rtl w:val="0"/>
+        </w:rPr>
+        <w:t xml:space="preserve">Issues</w:t>
+      </w:r>
+      <w:r>
+        <w:rPr>
+          <w:rtl w:val="0"/>
+        </w:rPr>
+        <w:t xml:space="preserve">: Use Case Diagram refinement.</w:t>
       </w:r>
     </w:p>
     <w:p>

</xml_diff>

<commit_message>
Team Journal week 5
</commit_message>
<xml_diff>
--- a/Reports, Logs & Evaluations/Team Journal/Team Journal SDT213.docx
+++ b/Reports, Logs & Evaluations/Team Journal/Team Journal SDT213.docx
@@ -655,6 +655,145 @@
         <w:rPr>
           <w:rtl w:val="0"/>
         </w:rPr>
+      </w:r>
+    </w:p>
+    <w:p>
+      <w:pPr>
+        <w:rPr/>
+      </w:pPr>
+      <w:r>
+        <w:rPr>
+          <w:rtl w:val="0"/>
+        </w:rPr>
+        <w:t xml:space="preserve">Week 5: 12/10/26-18/10/26</w:t>
+      </w:r>
+    </w:p>
+    <w:p>
+      <w:pPr>
+        <w:spacing w:line="360" w:lineRule="auto"/>
+        <w:rPr/>
+      </w:pPr>
+      <w:r>
+        <w:rPr>
+          <w:rtl w:val="0"/>
+        </w:rPr>
+        <w:t xml:space="preserve">18/10/26 </w:t>
+      </w:r>
+      <w:hyperlink r:id="rId10">
+        <w:r>
+          <w:rPr>
+            <w:color w:val="1155cc"/>
+            <w:u w:val="single"/>
+            <w:rtl w:val="0"/>
+          </w:rPr>
+          <w:t xml:space="preserve">meeting link</w:t>
+        </w:r>
+      </w:hyperlink>
+      <w:r>
+        <w:rPr>
+          <w:rtl w:val="0"/>
+        </w:rPr>
+        <w:t xml:space="preserve">  </w:t>
+      </w:r>
+    </w:p>
+    <w:p>
+      <w:pPr>
+        <w:spacing w:line="360" w:lineRule="auto"/>
+        <w:rPr/>
+      </w:pPr>
+      <w:r>
+        <w:rPr>
+          <w:i w:val="1"/>
+          <w:iCs w:val="1"/>
+          <w:rtl w:val="0"/>
+        </w:rPr>
+        <w:t xml:space="preserve">Discussed</w:t>
+      </w:r>
+      <w:r>
+        <w:rPr>
+          <w:rtl w:val="0"/>
+        </w:rPr>
+        <w:t xml:space="preserve">: Phase 2, code samples, CRC cards, timings, meeting with a client.</w:t>
+      </w:r>
+    </w:p>
+    <w:p>
+      <w:pPr>
+        <w:spacing w:line="360" w:lineRule="auto"/>
+        <w:rPr/>
+      </w:pPr>
+      <w:r>
+        <w:rPr>
+          <w:i w:val="1"/>
+          <w:iCs w:val="1"/>
+          <w:rtl w:val="0"/>
+        </w:rPr>
+        <w:t xml:space="preserve">Decisions</w:t>
+      </w:r>
+      <w:r>
+        <w:rPr>
+          <w:rtl w:val="0"/>
+        </w:rPr>
+        <w:t xml:space="preserve">: delegated work, decided on refinements</w:t>
+      </w:r>
+    </w:p>
+    <w:p>
+      <w:pPr>
+        <w:spacing w:line="360" w:lineRule="auto"/>
+        <w:rPr/>
+      </w:pPr>
+      <w:r>
+        <w:rPr>
+          <w:i w:val="1"/>
+          <w:iCs w:val="1"/>
+          <w:rtl w:val="0"/>
+        </w:rPr>
+        <w:t xml:space="preserve">Previous tasks completion</w:t>
+      </w:r>
+      <w:r>
+        <w:rPr>
+          <w:rtl w:val="0"/>
+        </w:rPr>
+        <w:t xml:space="preserve">: Most of Phase 2 is complete.</w:t>
+      </w:r>
+    </w:p>
+    <w:p>
+      <w:pPr>
+        <w:spacing w:line="360" w:lineRule="auto"/>
+        <w:rPr/>
+      </w:pPr>
+      <w:r>
+        <w:rPr>
+          <w:i w:val="1"/>
+          <w:iCs w:val="1"/>
+          <w:rtl w:val="0"/>
+        </w:rPr>
+        <w:t xml:space="preserve">Planned tasks for the week</w:t>
+      </w:r>
+      <w:r>
+        <w:rPr>
+          <w:rtl w:val="0"/>
+        </w:rPr>
+        <w:t xml:space="preserve">: present work, finalize report, update Jira, write first code</w:t>
+      </w:r>
+    </w:p>
+    <w:p>
+      <w:pPr>
+        <w:spacing w:line="360" w:lineRule="auto"/>
+        <w:rPr/>
+      </w:pPr>
+      <w:r>
+        <w:rPr>
+          <w:i w:val="1"/>
+          <w:iCs w:val="1"/>
+          <w:rtl w:val="0"/>
+        </w:rPr>
+        <w:t xml:space="preserve">Issues</w:t>
+      </w:r>
+      <w:r>
+        <w:rPr>
+          <w:rtl w:val="0"/>
+        </w:rPr>
+        <w:t xml:space="preserve">: Use Case Diagram visual style, first steps of code implementation.</w:t>
       </w:r>
     </w:p>
     <w:sectPr>

</xml_diff>